<commit_message>
Corrige e completa tabelas arts. 16, 18 e 21 com conteúdo truncado
Conteúdo adicional recuperado do comparativo_reuniao_exemplo.docx:

Art.º 16.º (Saúde): n.º 2 criadores completo — 5 sub-alíneas:
  maturidade esquelética, frequência máxima de ninhadas,
  proibição cobrição em lactação, rehoming (antes truncado em 2 sub-al.)

Art.º 18.º (Práticas Dolorosas): al. g) do n.º 5 completa
  ("limbs, head, ears, tail or hair, or lifting adult dogs or cats by the skin")
  + derogação para cães militares/polícia/alfândega (antes omitida)

Art.º 21.º (Publicidade em Linha): n.ºs 5 e 6 adicionados
  (sistema de verificação da Comissão + atos de execução)
  + n.º 4 com texto integral + elementos por diploma sem paralelo

https://claude.ai/code/session_013gc37ZfszD9QAJQ5M1gWcB
</commit_message>
<xml_diff>
--- a/tabela_art16_saude.docx
+++ b/tabela_art16_saude.docx
@@ -16,6 +16,7 @@
     </w:p>
     <w:p>
       <w:pPr>
+        <w:spacing w:after="40"/>
         <w:jc w:val="center"/>
       </w:pPr>
       <w:r>
@@ -267,7 +268,7 @@
               <w:br/>
               <w:t>[art.º 52.º do RGBEAC]</w:t>
               <w:br/>
-              <w:t>[correspondência parcial — sem diferenciação expressa para animais vulneráveis]</w:t>
+              <w:t>[correspondência parcial — inspeção a cada 4 horas (mais frequente que o mínimo diário); sem diferenciação expressa para animais vulneráveis]</w:t>
             </w:r>
           </w:p>
         </w:tc>
@@ -288,7 +289,7 @@
               <w:br/>
               <w:t>[n.º 3 do art.º 47.º do DL 214/2013]</w:t>
               <w:br/>
-              <w:t>[correspondência parcial — inspeção diária, sem diferenciação para animais vulneráveis]</w:t>
+              <w:t>[correspondência parcial — inspeção diária; sem diferenciação para animais vulneráveis]</w:t>
             </w:r>
           </w:p>
         </w:tc>
@@ -348,7 +349,7 @@
               <w:br/>
               <w:t>[n.º 2 do art.º 33.º do RGBEAC]</w:t>
               <w:br/>
-              <w:t>[correspondência parcial — sem referência a transferência para área separada]</w:t>
+              <w:t>[correspondência parcial — cuidados e tratamento previstos; sem referência a transferência para área separada]</w:t>
             </w:r>
           </w:p>
         </w:tc>
@@ -369,7 +370,7 @@
               <w:br/>
               <w:t>[art.º 6.º do DL 214/2013]</w:t>
               <w:br/>
-              <w:t>[correspondência parcial — retirar do local de venda; sem referência a área separada]</w:t>
+              <w:t>[correspondência parcial — retirar do local de venda; sem referência genérica a área separada]</w:t>
             </w:r>
           </w:p>
         </w:tc>
@@ -427,7 +428,7 @@
               </w:rPr>
               <w:t>sem correspondência</w:t>
               <w:br/>
-              <w:t>(sem referência a eutanásia por indicação veterinária com anestesia e analgesia)</w:t>
+              <w:t>(sem disposição sobre eutanásia por indicação veterinária com anestesia e analgesia)</w:t>
             </w:r>
           </w:p>
         </w:tc>
@@ -446,7 +447,7 @@
               </w:rPr>
               <w:t>sem correspondência</w:t>
               <w:br/>
-              <w:t>(sem referência a eutanásia por indicação veterinária com anestesia e analgesia)</w:t>
+              <w:t>(sem disposição sobre eutanásia por indicação veterinária com anestesia e analgesia)</w:t>
             </w:r>
           </w:p>
         </w:tc>
@@ -508,7 +509,7 @@
               <w:br/>
               <w:t>[n.º 1 do art.º 33.º do RGBEAC]</w:t>
               <w:br/>
-              <w:t>[correspondência parcial — tratamentos obrigatórios, implícito]</w:t>
+              <w:t>[correspondência parcial — tratamentos obrigatórios implícitos; parasitas não explicitados]</w:t>
             </w:r>
           </w:p>
         </w:tc>
@@ -529,7 +530,7 @@
               <w:br/>
               <w:t>[n.º 2 do art.º 49.º do DL 214/2013]</w:t>
               <w:br/>
-              <w:t>[correspondência direta — desparasitações]</w:t>
+              <w:t>[correspondência direta — desparasitações expressas]</w:t>
             </w:r>
           </w:p>
         </w:tc>
@@ -803,7 +804,7 @@
               <w:br/>
               <w:t>– any immediate action ending the life of the dog or cat with minimum pain and suffering using a method inducing instant death is undertaken by a trained competent person;</w:t>
               <w:br/>
-              <w:t>– the operator keeps a record of the use of the exemption."</w:t>
+              <w:t>– the operator keeps a record of the use of the exemption [for purposes of official control under Reg. (EU) 2017/625]."</w:t>
             </w:r>
           </w:p>
         </w:tc>
@@ -1021,7 +1022,9 @@
               <w:br/>
               <w:t>do art.º 16.º</w:t>
               <w:br/>
-              <w:t>[idade mínima reprodutoras]</w:t>
+              <w:t>[idade mínima +</w:t>
+              <w:br/>
+              <w:t>maturidade esquelética]</w:t>
             </w:r>
           </w:p>
         </w:tc>
@@ -1038,7 +1041,7 @@
               <w:rPr>
                 <w:sz w:val="16"/>
               </w:rPr>
-              <w:t>"bitches or queens are bred only if they have reached a minimum age"</w:t>
+              <w:t>"bitches or queens are bred only if they have reached a minimum age and skeletal maturity in accordance with point 3 of Annex I, and only if they have no diagnosed disease, clinical sign of diseases or physical conditions which could negatively impact their pregnancy and welfare"</w:t>
             </w:r>
           </w:p>
         </w:tc>
@@ -1081,6 +1084,237 @@
           </w:p>
         </w:tc>
       </w:tr>
+      <w:tr>
+        <w:tc>
+          <w:tcPr>
+            <w:tcW w:type="dxa" w:w="1417"/>
+          </w:tcPr>
+          <w:p>
+            <w:pPr>
+              <w:spacing w:before="0" w:after="20"/>
+              <w:jc w:val="left"/>
+            </w:pPr>
+            <w:r>
+              <w:rPr>
+                <w:b/>
+                <w:sz w:val="16"/>
+              </w:rPr>
+              <w:t>n.º 2, [al. c)],</w:t>
+              <w:br/>
+              <w:t>do art.º 16.º</w:t>
+              <w:br/>
+              <w:t>[frequência máxima</w:t>
+              <w:br/>
+              <w:t>de ninhadas]</w:t>
+            </w:r>
+          </w:p>
+        </w:tc>
+        <w:tc>
+          <w:tcPr>
+            <w:tcW w:type="dxa" w:w="3118"/>
+          </w:tcPr>
+          <w:p>
+            <w:pPr>
+              <w:spacing w:before="0" w:after="20"/>
+              <w:jc w:val="left"/>
+            </w:pPr>
+            <w:r>
+              <w:rPr>
+                <w:sz w:val="16"/>
+              </w:rPr>
+              <w:t>"the litter-giving pregnancies of bitches or queens follows a maximum frequency in accordance with point 3 of Annex I"</w:t>
+            </w:r>
+          </w:p>
+        </w:tc>
+        <w:tc>
+          <w:tcPr>
+            <w:tcW w:type="dxa" w:w="2438"/>
+          </w:tcPr>
+          <w:p>
+            <w:pPr>
+              <w:spacing w:before="0" w:after="20"/>
+              <w:jc w:val="left"/>
+            </w:pPr>
+            <w:r>
+              <w:rPr>
+                <w:sz w:val="16"/>
+              </w:rPr>
+              <w:t>sem correspondência</w:t>
+            </w:r>
+          </w:p>
+        </w:tc>
+        <w:tc>
+          <w:tcPr>
+            <w:tcW w:type="dxa" w:w="2438"/>
+          </w:tcPr>
+          <w:p>
+            <w:pPr>
+              <w:spacing w:before="0" w:after="20"/>
+              <w:jc w:val="left"/>
+            </w:pPr>
+            <w:r>
+              <w:rPr>
+                <w:sz w:val="16"/>
+              </w:rPr>
+              <w:t>sem correspondência</w:t>
+            </w:r>
+          </w:p>
+        </w:tc>
+      </w:tr>
+      <w:tr>
+        <w:tc>
+          <w:tcPr>
+            <w:tcW w:type="dxa" w:w="1417"/>
+          </w:tcPr>
+          <w:p>
+            <w:pPr>
+              <w:spacing w:before="0" w:after="20"/>
+              <w:jc w:val="left"/>
+            </w:pPr>
+            <w:r>
+              <w:rPr>
+                <w:b/>
+                <w:sz w:val="16"/>
+              </w:rPr>
+              <w:t>n.º 2, [al. d)],</w:t>
+              <w:br/>
+              <w:t>do art.º 16.º</w:t>
+              <w:br/>
+              <w:t>[proibição cobrição</w:t>
+              <w:br/>
+              <w:t>em lactação]</w:t>
+            </w:r>
+          </w:p>
+        </w:tc>
+        <w:tc>
+          <w:tcPr>
+            <w:tcW w:type="dxa" w:w="3118"/>
+          </w:tcPr>
+          <w:p>
+            <w:pPr>
+              <w:spacing w:before="0" w:after="20"/>
+              <w:jc w:val="left"/>
+            </w:pPr>
+            <w:r>
+              <w:rPr>
+                <w:sz w:val="16"/>
+              </w:rPr>
+              <w:t>"lactating queens are not mated or inseminated"</w:t>
+            </w:r>
+          </w:p>
+        </w:tc>
+        <w:tc>
+          <w:tcPr>
+            <w:tcW w:type="dxa" w:w="2438"/>
+          </w:tcPr>
+          <w:p>
+            <w:pPr>
+              <w:spacing w:before="0" w:after="20"/>
+              <w:jc w:val="left"/>
+            </w:pPr>
+            <w:r>
+              <w:rPr>
+                <w:sz w:val="16"/>
+              </w:rPr>
+              <w:t>sem correspondência</w:t>
+            </w:r>
+          </w:p>
+        </w:tc>
+        <w:tc>
+          <w:tcPr>
+            <w:tcW w:type="dxa" w:w="2438"/>
+          </w:tcPr>
+          <w:p>
+            <w:pPr>
+              <w:spacing w:before="0" w:after="20"/>
+              <w:jc w:val="left"/>
+            </w:pPr>
+            <w:r>
+              <w:rPr>
+                <w:sz w:val="16"/>
+              </w:rPr>
+              <w:t>sem correspondência</w:t>
+            </w:r>
+          </w:p>
+        </w:tc>
+      </w:tr>
+      <w:tr>
+        <w:tc>
+          <w:tcPr>
+            <w:tcW w:type="dxa" w:w="1417"/>
+          </w:tcPr>
+          <w:p>
+            <w:pPr>
+              <w:spacing w:before="0" w:after="20"/>
+              <w:jc w:val="left"/>
+            </w:pPr>
+            <w:r>
+              <w:rPr>
+                <w:b/>
+                <w:sz w:val="16"/>
+              </w:rPr>
+              <w:t>n.º 2, [al. e)],</w:t>
+              <w:br/>
+              <w:t>do art.º 16.º</w:t>
+              <w:br/>
+              <w:t>[rehoming /</w:t>
+              <w:br/>
+              <w:t>não abandono]</w:t>
+            </w:r>
+          </w:p>
+        </w:tc>
+        <w:tc>
+          <w:tcPr>
+            <w:tcW w:type="dxa" w:w="3118"/>
+          </w:tcPr>
+          <w:p>
+            <w:pPr>
+              <w:spacing w:before="0" w:after="20"/>
+              <w:jc w:val="left"/>
+            </w:pPr>
+            <w:r>
+              <w:rPr>
+                <w:sz w:val="16"/>
+              </w:rPr>
+              <w:t>"dogs and cats which are no longer used for reproduction, including as a result of the provisions of this Regulation, are either kept or sold, donated or rehomed, and not killed or abandoned"</w:t>
+            </w:r>
+          </w:p>
+        </w:tc>
+        <w:tc>
+          <w:tcPr>
+            <w:tcW w:type="dxa" w:w="2438"/>
+          </w:tcPr>
+          <w:p>
+            <w:pPr>
+              <w:spacing w:before="0" w:after="20"/>
+              <w:jc w:val="left"/>
+            </w:pPr>
+            <w:r>
+              <w:rPr>
+                <w:sz w:val="16"/>
+              </w:rPr>
+              <w:t>sem correspondência</w:t>
+            </w:r>
+          </w:p>
+        </w:tc>
+        <w:tc>
+          <w:tcPr>
+            <w:tcW w:type="dxa" w:w="2438"/>
+          </w:tcPr>
+          <w:p>
+            <w:pPr>
+              <w:spacing w:before="0" w:after="20"/>
+              <w:jc w:val="left"/>
+            </w:pPr>
+            <w:r>
+              <w:rPr>
+                <w:sz w:val="16"/>
+              </w:rPr>
+              <w:t>sem correspondência</w:t>
+            </w:r>
+          </w:p>
+        </w:tc>
+      </w:tr>
     </w:tbl>
     <w:p>
       <w:pPr>
@@ -1091,7 +1325,7 @@
           <w:i/>
           <w:sz w:val="15"/>
         </w:rPr>
-        <w:t>Nota: o texto do n.º 2 do art.º 16.º surge truncado no comparativo_reuniao_exemplo.docx; as sub-alíneas do n.º 2 são inferidas do contexto e da análise do art.º 8.º referenciado nas notas de divergência. Diplomas: @rgbeac (arts.º 33.º e 52.º), @codigo (arts.º 6.º, 47.º e 49.º do DL n.º 214/2013), @legislacao (arts.º 13.º e 16.º do DL n.º 276/2001, de 17 de outubro).</w:t>
+        <w:t>Nota: as sub-alíneas do n.º 2 não surgem letradas no texto do comparativo_reuniao_exemplo.docx; a designação [al. a)] a [al. e)] é inferida da sequência da norma. Necessidade de alteração (todos os diplomas): Sim — conforme notas de divergência do comparativo_reuniao_exemplo.docx. Fontes: @rgbeac (arts.º 33.º e 52.º), @codigo (arts.º 6.º, 47.º e 49.º do DL 214/2013), @legislacao (arts.º 13.º e 16.º do DL 276/2001).</w:t>
       </w:r>
     </w:p>
     <w:sectPr>

</xml_diff>